<commit_message>
Pin MySQL connectors to 26.10.0 across application and containers
</commit_message>
<xml_diff>
--- a/docs/Third-Party-Libraries.docx
+++ b/docs/Third-Party-Libraries.docx
@@ -273,7 +273,7 @@
               <w:pStyle w:val="TableText"/>
             </w:pPr>
             <w:r>
-              <w:t xml:space="preserve">MySQL Connector/Python / &gt;=9.5,&lt;10</w:t>
+              <w:t xml:space="preserve">MySQL Connector/Python / 26.10.0</w:t>
             </w:r>
           </w:p>
         </w:tc>
@@ -414,7 +414,7 @@
         <w:pStyle w:val="TableCitation"/>
       </w:pPr>
       <w:r>
-        <w:t xml:space="preserve">Connector/J 26.10.0 supersedes the 9.7 series and supports MySQL Server 8.4 and later. Connector/Python is a separate package and retains its existing version range.</w:t>
+        <w:t xml:space="preserve">Connector/J 26.10.0 supersedes the 9.7 series and supports MySQL Server 8.4 and later. Connector/Python is a separate package and is pinned to version 26.10.0.</w:t>
       </w:r>
     </w:p>
     <w:p>
@@ -1212,7 +1212,7 @@
         <w:pStyle w:val="Normal"/>
       </w:pPr>
       <w:r>
-        <w:t xml:space="preserve">Snapshot of the local review environment, not a deployment lockfile. Primary installed packages were Flask 3.1.3, Connector/Python 9.7.0, OCI SDK 2.189.0, Gunicorn 23.0.0 and Requests 2.34.2.</w:t>
+        <w:t xml:space="preserve">Snapshot of the local review environment, not a deployment lockfile. Primary installed packages were Flask 3.1.3, Connector/Python 26.10.0, OCI SDK 2.189.0, Gunicorn 23.0.0 and Requests 2.34.2.</w:t>
       </w:r>
     </w:p>
     <w:tbl>
@@ -1688,7 +1688,7 @@
         <w:pStyle w:val="Source"/>
       </w:pPr>
       <w:r>
-        <w:t xml:space="preserve">Repository evidence: requirements.txt, deploy/native-capture/pom.xml, the capture/writer Containerfiles and docs/third-party-licenses.md. Implementation baseline: revision 819311a.</w:t>
+        <w:t xml:space="preserve">Repository evidence: requirements.txt, deploy/native-capture/pom.xml, the capture/writer Containerfiles and docs/third-party-licenses.md. Connector/J and Connector/Python are both pinned to 26.10.0.</w:t>
       </w:r>
     </w:p>
     <w:p>

</xml_diff>